<commit_message>
Deploy preview for PR 31 🛫
</commit_message>
<xml_diff>
--- a/pr-preview/pr-31/chapters/chapter2-tracked-changes.docx
+++ b/pr-preview/pr-31/chapters/chapter2-tracked-changes.docx
@@ -198,16 +198,12 @@
       <w:pPr>
         <w:pStyle w:val="FirstParagraph"/>
       </w:pPr>
-      <w:ins w:id="1007" w:author="PR Preview" w:date="2024-01-01T00:00:00Z">
-        <w:r>
-          <w:t xml:space="preserve">Direct link to the equation anchor:</w:t>
-        </w:r>
-      </w:ins>
-      <w:ins w:id="1007" w:author="PR Preview" w:date="2024-01-01T00:00:00Z">
-        <w:r>
-          <w:t xml:space="preserve"> </w:t>
-        </w:r>
-      </w:ins>
+      <w:r>
+        <w:t xml:space="preserve">Direct link to the equation anchor:</w:t>
+      </w:r>
+      <w:r>
+        <w:t xml:space="preserve"> </w:t>
+      </w:r>
       <w:hyperlink w:anchor="eq-gaussian-integral">
         <w:r>
           <w:rPr>
@@ -216,11 +212,9 @@
           <w:t xml:space="preserve">Equation</w:t>
         </w:r>
       </w:hyperlink>
-      <w:ins w:id="1007" w:author="PR Preview" w:date="2024-01-01T00:00:00Z">
-        <w:r>
-          <w:t xml:space="preserve">.</w:t>
-        </w:r>
-      </w:ins>
+      <w:r>
+        <w:t xml:space="preserve">.</w:t>
+      </w:r>
     </w:p>
     <w:bookmarkEnd w:id="10"/>
     <w:bookmarkStart w:id="12" w:name="tables"/>

</xml_diff>